<commit_message>
feat: sync Dovernost and Blanka data, add export selector, fix 1-page davernost and blanka date updates
</commit_message>
<xml_diff>
--- a/public/templates/davernost.docx
+++ b/public/templates/davernost.docx
@@ -1580,1544 +1580,6 @@
           <w:lang w:val="uz-Cyrl-UZ"/>
         </w:rPr>
         <w:t>ООО “MUSFIRA  SAVDO TRANS” директор :                   Б.П. МАМАЖОНОВ</w:t>
-      </w:r>
-    </w:p>
-    <w:p>
-      <w:pPr>
-        <w:tabs>
-          <w:tab w:val="left" w:pos="367"/>
-        </w:tabs>
-        <w:jc w:val="both"/>
-        <w:rPr>
-          <w:rFonts w:ascii="Times New Roman" w:hAnsi="Times New Roman"/>
-          <w:b/>
-          <w:sz w:val="28"/>
-          <w:szCs w:val="28"/>
-          <w:lang w:val="uz-Cyrl-UZ"/>
-        </w:rPr>
-      </w:pPr>
-      <w:r>
-        <w:rPr>
-          <w:b/>
-          <w:sz w:val="28"/>
-          <w:szCs w:val="28"/>
-          <w:lang w:val="uz-Cyrl-UZ"/>
-        </w:rPr>
-        <w:lastRenderedPageBreak/>
-        <w:t xml:space="preserve"> </w:t>
-      </w:r>
-    </w:p>
-    <w:tbl>
-      <w:tblPr>
-        <w:tblpPr w:leftFromText="180" w:rightFromText="180" w:vertAnchor="text" w:horzAnchor="margin" w:tblpXSpec="center" w:tblpY="-172"/>
-        <w:tblW w:w="10472" w:type="dxa"/>
-        <w:tblBorders>
-          <w:bottom w:val="thickThinMediumGap" w:sz="24" w:space="0" w:color="006600"/>
-          <w:insideH w:val="thickThinMediumGap" w:sz="24" w:space="0" w:color="006600"/>
-        </w:tblBorders>
-        <w:tblLook w:val="04A0" w:firstRow="1" w:lastRow="0" w:firstColumn="1" w:lastColumn="0" w:noHBand="0" w:noVBand="1"/>
-      </w:tblPr>
-      <w:tblGrid>
-        <w:gridCol w:w="4097"/>
-        <w:gridCol w:w="2279"/>
-        <w:gridCol w:w="4096"/>
-      </w:tblGrid>
-      <w:tr>
-        <w:trPr>
-          <w:trHeight w:val="1848"/>
-        </w:trPr>
-        <w:tc>
-          <w:tcPr>
-            <w:tcW w:w="4097" w:type="dxa"/>
-          </w:tcPr>
-          <w:p>
-            <w:pPr>
-              <w:pStyle w:val="a3"/>
-              <w:spacing w:line="276" w:lineRule="auto"/>
-              <w:jc w:val="center"/>
-              <w:rPr>
-                <w:b/>
-                <w:color w:val="1F497D"/>
-                <w:sz w:val="6"/>
-                <w:szCs w:val="6"/>
-                <w:lang w:val="en-US"/>
-              </w:rPr>
-            </w:pPr>
-            <w:r>
-              <w:rPr>
-                <w:b/>
-                <w:color w:val="1F497D"/>
-                <w:sz w:val="6"/>
-                <w:szCs w:val="6"/>
-                <w:lang w:val="en-US"/>
-              </w:rPr>
-              <w:t>M</w:t>
-            </w:r>
-          </w:p>
-          <w:p>
-            <w:pPr>
-              <w:pStyle w:val="a3"/>
-              <w:spacing w:line="276" w:lineRule="auto"/>
-              <w:jc w:val="center"/>
-              <w:rPr>
-                <w:b/>
-                <w:color w:val="1F497D"/>
-                <w:sz w:val="4"/>
-                <w:szCs w:val="4"/>
-                <w:lang w:val="en-US"/>
-              </w:rPr>
-            </w:pPr>
-          </w:p>
-          <w:p>
-            <w:pPr>
-              <w:pStyle w:val="a3"/>
-              <w:spacing w:line="276" w:lineRule="auto"/>
-              <w:jc w:val="center"/>
-              <w:rPr>
-                <w:b/>
-                <w:color w:val="auto"/>
-                <w:sz w:val="24"/>
-                <w:szCs w:val="24"/>
-                <w:lang w:val="en-US"/>
-              </w:rPr>
-            </w:pPr>
-            <w:r>
-              <w:rPr>
-                <w:b/>
-                <w:color w:val="auto"/>
-                <w:sz w:val="24"/>
-                <w:szCs w:val="24"/>
-                <w:lang w:val="en-US"/>
-              </w:rPr>
-              <w:t xml:space="preserve">O’ZBEKISTON RESPUBLIKASI </w:t>
-            </w:r>
-          </w:p>
-          <w:p>
-            <w:pPr>
-              <w:pStyle w:val="a3"/>
-              <w:spacing w:line="276" w:lineRule="auto"/>
-              <w:jc w:val="center"/>
-              <w:rPr>
-                <w:b/>
-                <w:color w:val="auto"/>
-                <w:sz w:val="24"/>
-                <w:szCs w:val="24"/>
-                <w:lang w:val="en-US"/>
-              </w:rPr>
-            </w:pPr>
-            <w:r>
-              <w:rPr>
-                <w:b/>
-                <w:color w:val="auto"/>
-                <w:sz w:val="24"/>
-                <w:szCs w:val="24"/>
-                <w:lang w:val="en-US"/>
-              </w:rPr>
-              <w:t>FARG’ONA VILOYATI DANGARA</w:t>
-            </w:r>
-            <w:r>
-              <w:rPr>
-                <w:b/>
-                <w:color w:val="auto"/>
-                <w:sz w:val="24"/>
-                <w:szCs w:val="24"/>
-                <w:lang w:val="en-US"/>
-              </w:rPr>
-              <w:t xml:space="preserve"> TUMANI</w:t>
-            </w:r>
-          </w:p>
-          <w:p>
-            <w:pPr>
-              <w:pStyle w:val="a3"/>
-              <w:spacing w:line="276" w:lineRule="auto"/>
-              <w:jc w:val="center"/>
-              <w:rPr>
-                <w:b/>
-                <w:sz w:val="28"/>
-                <w:szCs w:val="28"/>
-                <w:lang w:val="en-US"/>
-              </w:rPr>
-            </w:pPr>
-            <w:r>
-              <w:rPr>
-                <w:b/>
-                <w:sz w:val="24"/>
-                <w:szCs w:val="24"/>
-              </w:rPr>
-              <w:t>«</w:t>
-            </w:r>
-            <w:r>
-              <w:rPr>
-                <w:b/>
-                <w:sz w:val="24"/>
-                <w:szCs w:val="24"/>
-                <w:lang w:val="en-US"/>
-              </w:rPr>
-              <w:t>MUSFIRA</w:t>
-            </w:r>
-            <w:r>
-              <w:rPr>
-                <w:b/>
-                <w:sz w:val="24"/>
-                <w:szCs w:val="24"/>
-              </w:rPr>
-              <w:t xml:space="preserve"> </w:t>
-            </w:r>
-            <w:r>
-              <w:rPr>
-                <w:b/>
-                <w:sz w:val="24"/>
-                <w:szCs w:val="24"/>
-                <w:lang w:val="en-US"/>
-              </w:rPr>
-              <w:t>SAVDO</w:t>
-            </w:r>
-            <w:r>
-              <w:rPr>
-                <w:b/>
-                <w:sz w:val="24"/>
-                <w:szCs w:val="24"/>
-              </w:rPr>
-              <w:t xml:space="preserve"> </w:t>
-            </w:r>
-            <w:r>
-              <w:rPr>
-                <w:b/>
-                <w:sz w:val="24"/>
-                <w:szCs w:val="24"/>
-                <w:lang w:val="en-US"/>
-              </w:rPr>
-              <w:t>TRANS</w:t>
-            </w:r>
-            <w:r>
-              <w:rPr>
-                <w:b/>
-                <w:sz w:val="24"/>
-                <w:szCs w:val="24"/>
-              </w:rPr>
-              <w:t>»</w:t>
-            </w:r>
-            <w:r>
-              <w:rPr>
-                <w:b/>
-                <w:sz w:val="24"/>
-                <w:szCs w:val="24"/>
-                <w:lang w:val="en-US"/>
-              </w:rPr>
-              <w:t xml:space="preserve"> MCHJ</w:t>
-            </w:r>
-            <w:r>
-              <w:rPr>
-                <w:b/>
-                <w:sz w:val="24"/>
-                <w:szCs w:val="24"/>
-              </w:rPr>
-              <w:t xml:space="preserve"> </w:t>
-            </w:r>
-            <w:r>
-              <w:rPr>
-                <w:b/>
-                <w:color w:val="auto"/>
-                <w:sz w:val="16"/>
-                <w:szCs w:val="16"/>
-                <w:lang w:val="en-US"/>
-              </w:rPr>
-              <w:t xml:space="preserve"> </w:t>
-            </w:r>
-          </w:p>
-        </w:tc>
-        <w:tc>
-          <w:tcPr>
-            <w:tcW w:w="2279" w:type="dxa"/>
-          </w:tcPr>
-          <w:p>
-            <w:pPr>
-              <w:rPr>
-                <w:b/>
-                <w:sz w:val="28"/>
-                <w:szCs w:val="28"/>
-                <w:lang w:val="en-US"/>
-              </w:rPr>
-            </w:pPr>
-            <w:r>
-              <w:rPr>
-                <w:b/>
-                <w:noProof/>
-                <w:sz w:val="28"/>
-                <w:szCs w:val="28"/>
-                <w:lang w:val="en-US"/>
-              </w:rPr>
-              <w:t xml:space="preserve">  </w:t>
-            </w:r>
-            <w:r>
-              <w:rPr>
-                <w:b/>
-                <w:noProof/>
-                <w:sz w:val="28"/>
-                <w:szCs w:val="28"/>
-              </w:rPr>
-              <w:drawing>
-                <wp:inline distT="0" distB="0" distL="0" distR="0" wp14:anchorId="41156FCE" wp14:editId="6E6F1616">
-                  <wp:extent cx="1009650" cy="946150"/>
-                  <wp:effectExtent l="19050" t="0" r="0" b="0"/>
-                  <wp:docPr id="1" name="Рисунок 1" descr="https://a.d-cd.net/d385b3cs-960.jpg"/>
-                  <wp:cNvGraphicFramePr>
-                    <a:graphicFrameLocks xmlns:a="http://schemas.openxmlformats.org/drawingml/2006/main" noChangeAspect="1"/>
-                  </wp:cNvGraphicFramePr>
-                  <a:graphic xmlns:a="http://schemas.openxmlformats.org/drawingml/2006/main">
-                    <a:graphicData uri="http://schemas.openxmlformats.org/drawingml/2006/picture">
-                      <pic:pic xmlns:pic="http://schemas.openxmlformats.org/drawingml/2006/picture">
-                        <pic:nvPicPr>
-                          <pic:cNvPr id="0" name="Рисунок 1" descr="https://a.d-cd.net/d385b3cs-960.jpg"/>
-                          <pic:cNvPicPr>
-                            <a:picLocks noChangeAspect="1" noChangeArrowheads="1"/>
-                          </pic:cNvPicPr>
-                        </pic:nvPicPr>
-                        <pic:blipFill>
-                          <a:blip r:embed="rId5" cstate="print"/>
-                          <a:srcRect/>
-                          <a:stretch>
-                            <a:fillRect/>
-                          </a:stretch>
-                        </pic:blipFill>
-                        <pic:spPr bwMode="auto">
-                          <a:xfrm>
-                            <a:off x="0" y="0"/>
-                            <a:ext cx="1009650" cy="946150"/>
-                          </a:xfrm>
-                          <a:prstGeom prst="rect">
-                            <a:avLst/>
-                          </a:prstGeom>
-                          <a:noFill/>
-                          <a:ln w="9525">
-                            <a:noFill/>
-                            <a:miter lim="800000"/>
-                            <a:headEnd/>
-                            <a:tailEnd/>
-                          </a:ln>
-                        </pic:spPr>
-                      </pic:pic>
-                    </a:graphicData>
-                  </a:graphic>
-                </wp:inline>
-              </w:drawing>
-            </w:r>
-          </w:p>
-        </w:tc>
-        <w:tc>
-          <w:tcPr>
-            <w:tcW w:w="4096" w:type="dxa"/>
-          </w:tcPr>
-          <w:p>
-            <w:pPr>
-              <w:pStyle w:val="a3"/>
-              <w:spacing w:line="276" w:lineRule="auto"/>
-              <w:jc w:val="center"/>
-              <w:rPr>
-                <w:b/>
-                <w:color w:val="1F497D"/>
-                <w:sz w:val="4"/>
-                <w:szCs w:val="4"/>
-              </w:rPr>
-            </w:pPr>
-          </w:p>
-          <w:p>
-            <w:pPr>
-              <w:pStyle w:val="a3"/>
-              <w:spacing w:line="276" w:lineRule="auto"/>
-              <w:jc w:val="center"/>
-              <w:rPr>
-                <w:b/>
-                <w:sz w:val="24"/>
-                <w:szCs w:val="24"/>
-              </w:rPr>
-            </w:pPr>
-            <w:r>
-              <w:rPr>
-                <w:b/>
-                <w:color w:val="auto"/>
-                <w:sz w:val="24"/>
-                <w:szCs w:val="24"/>
-              </w:rPr>
-              <w:t>РЕСПУБЛИКА УЗБЕКИСТАН</w:t>
-            </w:r>
-            <w:r>
-              <w:rPr>
-                <w:b/>
-                <w:color w:val="auto"/>
-                <w:sz w:val="24"/>
-                <w:szCs w:val="24"/>
-              </w:rPr>
-              <w:t xml:space="preserve"> ФЕРГАНСКАЯ ОБЛАСТЬ ДАНГАРАЙСКИЙ</w:t>
-            </w:r>
-            <w:r>
-              <w:rPr>
-                <w:b/>
-                <w:color w:val="auto"/>
-                <w:sz w:val="24"/>
-                <w:szCs w:val="24"/>
-              </w:rPr>
-              <w:t xml:space="preserve"> </w:t>
-            </w:r>
-            <w:proofErr w:type="gramStart"/>
-            <w:r>
-              <w:rPr>
-                <w:b/>
-                <w:color w:val="auto"/>
-                <w:sz w:val="24"/>
-                <w:szCs w:val="24"/>
-              </w:rPr>
-              <w:t xml:space="preserve">РАЙОН </w:t>
-            </w:r>
-            <w:r>
-              <w:rPr>
-                <w:b/>
-                <w:sz w:val="24"/>
-                <w:szCs w:val="24"/>
-              </w:rPr>
-              <w:t xml:space="preserve"> ООО</w:t>
-            </w:r>
-            <w:proofErr w:type="gramEnd"/>
-            <w:r>
-              <w:rPr>
-                <w:b/>
-                <w:sz w:val="24"/>
-                <w:szCs w:val="24"/>
-              </w:rPr>
-              <w:t>«</w:t>
-            </w:r>
-            <w:r>
-              <w:rPr>
-                <w:b/>
-                <w:sz w:val="24"/>
-                <w:szCs w:val="24"/>
-                <w:lang w:val="en-US"/>
-              </w:rPr>
-              <w:t>MUSFIRA</w:t>
-            </w:r>
-            <w:r>
-              <w:rPr>
-                <w:b/>
-                <w:sz w:val="24"/>
-                <w:szCs w:val="24"/>
-              </w:rPr>
-              <w:t xml:space="preserve"> </w:t>
-            </w:r>
-            <w:r>
-              <w:rPr>
-                <w:b/>
-                <w:sz w:val="24"/>
-                <w:szCs w:val="24"/>
-                <w:lang w:val="en-US"/>
-              </w:rPr>
-              <w:t>SAVDO</w:t>
-            </w:r>
-            <w:r>
-              <w:rPr>
-                <w:b/>
-                <w:sz w:val="24"/>
-                <w:szCs w:val="24"/>
-              </w:rPr>
-              <w:t xml:space="preserve"> </w:t>
-            </w:r>
-            <w:r>
-              <w:rPr>
-                <w:b/>
-                <w:sz w:val="24"/>
-                <w:szCs w:val="24"/>
-                <w:lang w:val="en-US"/>
-              </w:rPr>
-              <w:t>TRANS</w:t>
-            </w:r>
-            <w:r>
-              <w:rPr>
-                <w:b/>
-                <w:sz w:val="24"/>
-                <w:szCs w:val="24"/>
-              </w:rPr>
-              <w:t xml:space="preserve">» </w:t>
-            </w:r>
-            <w:r>
-              <w:rPr>
-                <w:b/>
-                <w:color w:val="auto"/>
-                <w:sz w:val="24"/>
-                <w:szCs w:val="24"/>
-              </w:rPr>
-              <w:t xml:space="preserve"> </w:t>
-            </w:r>
-          </w:p>
-          <w:p>
-            <w:pPr>
-              <w:jc w:val="center"/>
-              <w:rPr>
-                <w:b/>
-                <w:sz w:val="28"/>
-                <w:szCs w:val="28"/>
-              </w:rPr>
-            </w:pPr>
-          </w:p>
-        </w:tc>
-      </w:tr>
-      <w:tr>
-        <w:trPr>
-          <w:trHeight w:val="538"/>
-        </w:trPr>
-        <w:tc>
-          <w:tcPr>
-            <w:tcW w:w="10472" w:type="dxa"/>
-            <w:gridSpan w:val="3"/>
-            <w:tcBorders>
-              <w:top w:val="thickThinMediumGap" w:sz="24" w:space="0" w:color="006600"/>
-              <w:left w:val="nil"/>
-              <w:bottom w:val="thinThickMediumGap" w:sz="24" w:space="0" w:color="006600"/>
-              <w:right w:val="nil"/>
-            </w:tcBorders>
-          </w:tcPr>
-          <w:p>
-            <w:pPr>
-              <w:spacing w:after="0" w:line="240" w:lineRule="auto"/>
-              <w:jc w:val="center"/>
-              <w:rPr>
-                <w:b/>
-                <w:i/>
-                <w:sz w:val="20"/>
-                <w:szCs w:val="20"/>
-              </w:rPr>
-            </w:pPr>
-            <w:proofErr w:type="gramStart"/>
-            <w:r>
-              <w:rPr>
-                <w:b/>
-                <w:sz w:val="20"/>
-                <w:szCs w:val="20"/>
-              </w:rPr>
-              <w:t>ООО«</w:t>
-            </w:r>
-            <w:proofErr w:type="gramEnd"/>
-            <w:r>
-              <w:rPr>
-                <w:b/>
-                <w:sz w:val="20"/>
-                <w:szCs w:val="20"/>
-                <w:lang w:val="en-US"/>
-              </w:rPr>
-              <w:t>MUSFIRA</w:t>
-            </w:r>
-            <w:r>
-              <w:rPr>
-                <w:b/>
-                <w:sz w:val="20"/>
-                <w:szCs w:val="20"/>
-              </w:rPr>
-              <w:t xml:space="preserve"> </w:t>
-            </w:r>
-            <w:r>
-              <w:rPr>
-                <w:b/>
-                <w:sz w:val="20"/>
-                <w:szCs w:val="20"/>
-                <w:lang w:val="en-US"/>
-              </w:rPr>
-              <w:t>SAVDO</w:t>
-            </w:r>
-            <w:r>
-              <w:rPr>
-                <w:b/>
-                <w:sz w:val="20"/>
-                <w:szCs w:val="20"/>
-              </w:rPr>
-              <w:t xml:space="preserve"> </w:t>
-            </w:r>
-            <w:r>
-              <w:rPr>
-                <w:b/>
-                <w:sz w:val="20"/>
-                <w:szCs w:val="20"/>
-                <w:lang w:val="en-US"/>
-              </w:rPr>
-              <w:t>TRANS</w:t>
-            </w:r>
-            <w:r>
-              <w:rPr>
-                <w:b/>
-                <w:sz w:val="20"/>
-                <w:szCs w:val="20"/>
-              </w:rPr>
-              <w:t xml:space="preserve">»  Республика Узбекистан, </w:t>
-            </w:r>
-            <w:r>
-              <w:rPr>
-                <w:b/>
-                <w:sz w:val="20"/>
-                <w:szCs w:val="20"/>
-              </w:rPr>
-              <w:t xml:space="preserve">Ферганская область, ДАНГАРАЙСКИЙ район , улица </w:t>
-            </w:r>
-            <w:proofErr w:type="spellStart"/>
-            <w:r>
-              <w:rPr>
-                <w:b/>
-                <w:sz w:val="20"/>
-                <w:szCs w:val="20"/>
-              </w:rPr>
-              <w:t>саноат</w:t>
-            </w:r>
-            <w:proofErr w:type="spellEnd"/>
-            <w:r>
-              <w:rPr>
-                <w:b/>
-                <w:sz w:val="20"/>
-                <w:szCs w:val="20"/>
-              </w:rPr>
-              <w:t xml:space="preserve"> 2  ИНН:305126811</w:t>
-            </w:r>
-            <w:r>
-              <w:rPr>
-                <w:b/>
-                <w:sz w:val="20"/>
-                <w:szCs w:val="20"/>
-              </w:rPr>
-              <w:t>,  ОК</w:t>
-            </w:r>
-            <w:r>
-              <w:rPr>
-                <w:b/>
-                <w:sz w:val="28"/>
-                <w:szCs w:val="28"/>
-                <w:lang w:val="uz-Cyrl-UZ"/>
-              </w:rPr>
-              <w:t>эд</w:t>
-            </w:r>
-            <w:r>
-              <w:rPr>
-                <w:b/>
-                <w:sz w:val="20"/>
-                <w:szCs w:val="20"/>
-              </w:rPr>
-              <w:t>:</w:t>
-            </w:r>
-            <w:r>
-              <w:rPr>
-                <w:b/>
-                <w:sz w:val="20"/>
-                <w:szCs w:val="20"/>
-                <w:lang w:val="uz-Cyrl-UZ"/>
-              </w:rPr>
-              <w:t>49410</w:t>
-            </w:r>
-            <w:r>
-              <w:rPr>
-                <w:b/>
-                <w:sz w:val="20"/>
-                <w:szCs w:val="20"/>
-              </w:rPr>
-              <w:t>, тел: +998916861345</w:t>
-            </w:r>
-            <w:r>
-              <w:rPr>
-                <w:b/>
-                <w:sz w:val="20"/>
-                <w:szCs w:val="20"/>
-              </w:rPr>
-              <w:t xml:space="preserve"> 15</w:t>
-            </w:r>
-            <w:r>
-              <w:rPr>
-                <w:b/>
-                <w:sz w:val="20"/>
-                <w:szCs w:val="20"/>
-              </w:rPr>
-              <w:t>0500</w:t>
-            </w:r>
-          </w:p>
-        </w:tc>
-      </w:tr>
-    </w:tbl>
-    <w:p>
-      <w:pPr>
-        <w:tabs>
-          <w:tab w:val="left" w:pos="367"/>
-        </w:tabs>
-        <w:jc w:val="both"/>
-        <w:rPr>
-          <w:rFonts w:ascii="Times New Roman" w:hAnsi="Times New Roman"/>
-          <w:b/>
-          <w:sz w:val="28"/>
-          <w:szCs w:val="28"/>
-        </w:rPr>
-      </w:pPr>
-    </w:p>
-    <w:p>
-      <w:pPr>
-        <w:rPr>
-          <w:sz w:val="28"/>
-          <w:szCs w:val="28"/>
-          <w:lang w:val="uz-Cyrl-UZ"/>
-        </w:rPr>
-      </w:pPr>
-      <w:r>
-        <w:rPr>
-          <w:rFonts w:ascii="Times New Roman" w:hAnsi="Times New Roman"/>
-          <w:b/>
-          <w:sz w:val="28"/>
-          <w:szCs w:val="28"/>
-          <w:lang w:val="uz-Cyrl-UZ"/>
-        </w:rPr>
-        <w:t xml:space="preserve">               </w:t>
-      </w:r>
-      <w:r>
-        <w:rPr>
-          <w:rFonts w:ascii="Times New Roman" w:hAnsi="Times New Roman"/>
-          <w:b/>
-          <w:sz w:val="28"/>
-          <w:szCs w:val="28"/>
-          <w:lang w:val="uz-Cyrl-UZ"/>
-        </w:rPr>
-        <w:t xml:space="preserve">                      </w:t>
-      </w:r>
-      <w:r>
-        <w:rPr>
-          <w:rFonts w:ascii="Times New Roman" w:hAnsi="Times New Roman"/>
-          <w:b/>
-          <w:sz w:val="28"/>
-          <w:szCs w:val="28"/>
-          <w:lang w:val="uz-Cyrl-UZ"/>
-        </w:rPr>
-        <w:t xml:space="preserve"> </w:t>
-      </w:r>
-      <w:r>
-        <w:rPr>
-          <w:b/>
-          <w:sz w:val="52"/>
-          <w:szCs w:val="52"/>
-          <w:lang w:val="uz-Cyrl-UZ"/>
-        </w:rPr>
-        <w:t>ДОВЕРЕННОСТЬ</w:t>
-      </w:r>
-    </w:p>
-    <w:p>
-      <w:pPr>
-        <w:jc w:val="both"/>
-        <w:rPr>
-          <w:rFonts w:ascii="Arial" w:hAnsi="Arial" w:cs="Arial"/>
-          <w:b/>
-        </w:rPr>
-      </w:pPr>
-      <w:r>
-        <w:rPr>
-          <w:rFonts w:ascii="Arial" w:hAnsi="Arial" w:cs="Arial"/>
-          <w:b/>
-          <w:lang w:val="uz-Cyrl-UZ"/>
-        </w:rPr>
-        <w:t xml:space="preserve">Настоящая доверенность выдана: </w:t>
-      </w:r>
-      <w:bookmarkStart w:id="17" w:name="_Hlk237594079"/>
-      <w:r>
-        <w:rPr>
-          <w:rFonts w:ascii="Times New Roman" w:hAnsi="Times New Roman"/>
-          <w:sz w:val="28"/>
-          <w:szCs w:val="28"/>
-          <w:lang w:val="en-US"/>
-        </w:rPr>
-        <w:t>AZIZOV</w:t>
-      </w:r>
-      <w:r>
-        <w:rPr>
-          <w:rFonts w:ascii="Times New Roman" w:hAnsi="Times New Roman"/>
-          <w:sz w:val="28"/>
-          <w:szCs w:val="28"/>
-        </w:rPr>
-        <w:t xml:space="preserve"> </w:t>
-      </w:r>
-      <w:r>
-        <w:rPr>
-          <w:rFonts w:ascii="Times New Roman" w:hAnsi="Times New Roman"/>
-          <w:sz w:val="28"/>
-          <w:szCs w:val="28"/>
-          <w:lang w:val="en-US"/>
-        </w:rPr>
-        <w:t>JAMSHIDJON</w:t>
-      </w:r>
-      <w:r>
-        <w:rPr>
-          <w:rFonts w:ascii="Times New Roman" w:hAnsi="Times New Roman"/>
-          <w:sz w:val="28"/>
-          <w:szCs w:val="28"/>
-        </w:rPr>
-        <w:t xml:space="preserve"> </w:t>
-      </w:r>
-      <w:r>
-        <w:rPr>
-          <w:rFonts w:ascii="Times New Roman" w:hAnsi="Times New Roman"/>
-          <w:sz w:val="28"/>
-          <w:szCs w:val="28"/>
-          <w:lang w:val="en-US"/>
-        </w:rPr>
-        <w:t>RASULJON</w:t>
-      </w:r>
-      <w:r>
-        <w:rPr>
-          <w:rFonts w:ascii="Times New Roman" w:hAnsi="Times New Roman"/>
-          <w:sz w:val="28"/>
-          <w:szCs w:val="28"/>
-        </w:rPr>
-        <w:t xml:space="preserve"> </w:t>
-      </w:r>
-      <w:r>
-        <w:rPr>
-          <w:rFonts w:ascii="Times New Roman" w:hAnsi="Times New Roman"/>
-          <w:sz w:val="28"/>
-          <w:szCs w:val="28"/>
-          <w:lang w:val="en-US"/>
-        </w:rPr>
-        <w:t>UGLI</w:t>
-      </w:r>
-      <w:bookmarkEnd w:id="17"/>
-      <w:r>
-        <w:rPr>
-          <w:rFonts w:ascii="Arial" w:hAnsi="Arial" w:cs="Arial"/>
-        </w:rPr>
-        <w:t xml:space="preserve">  </w:t>
-      </w:r>
-      <w:r>
-        <w:rPr>
-          <w:rFonts w:ascii="Arial" w:hAnsi="Arial" w:cs="Arial"/>
-          <w:b/>
-        </w:rPr>
-        <w:t xml:space="preserve">  паспорт</w:t>
-      </w:r>
-      <w:r>
-        <w:rPr>
-          <w:rFonts w:ascii="Arial" w:hAnsi="Arial" w:cs="Arial"/>
-          <w:b/>
-        </w:rPr>
-        <w:t xml:space="preserve">        </w:t>
-      </w:r>
-      <w:r>
-        <w:rPr>
-          <w:rFonts w:ascii="Arial" w:hAnsi="Arial" w:cs="Arial"/>
-          <w:b/>
-        </w:rPr>
-        <w:t xml:space="preserve">      </w:t>
-      </w:r>
-      <w:bookmarkStart w:id="18" w:name="_Hlk237594185"/>
-      <w:r>
-        <w:rPr>
-          <w:rFonts w:ascii="Arial" w:hAnsi="Arial" w:cs="Arial"/>
-          <w:b/>
-          <w:lang w:val="en-US"/>
-        </w:rPr>
-        <w:t>F</w:t>
-      </w:r>
-      <w:r>
-        <w:rPr>
-          <w:rFonts w:ascii="Arial" w:hAnsi="Arial" w:cs="Arial"/>
-          <w:b/>
-          <w:lang w:val="en-US"/>
-        </w:rPr>
-        <w:t>A</w:t>
-      </w:r>
-      <w:r>
-        <w:rPr>
-          <w:rFonts w:ascii="Arial" w:hAnsi="Arial" w:cs="Arial"/>
-          <w:b/>
-        </w:rPr>
-        <w:t xml:space="preserve"> 8078525</w:t>
-      </w:r>
-      <w:r>
-        <w:rPr>
-          <w:rFonts w:ascii="Arial" w:hAnsi="Arial" w:cs="Arial"/>
-        </w:rPr>
-        <w:t xml:space="preserve"> </w:t>
-      </w:r>
-      <w:r>
-        <w:rPr>
-          <w:rFonts w:ascii="Arial" w:hAnsi="Arial" w:cs="Arial"/>
-          <w:b/>
-        </w:rPr>
-        <w:t xml:space="preserve">  </w:t>
-      </w:r>
-      <w:bookmarkEnd w:id="18"/>
-      <w:r>
-        <w:rPr>
-          <w:rFonts w:ascii="Arial" w:hAnsi="Arial" w:cs="Arial"/>
-          <w:b/>
-          <w:lang w:val="uz-Cyrl-UZ"/>
-        </w:rPr>
-        <w:t xml:space="preserve">выданный  </w:t>
-      </w:r>
-      <w:bookmarkStart w:id="19" w:name="_Hlk237594208"/>
-      <w:r>
-        <w:rPr>
-          <w:rFonts w:ascii="Arial" w:hAnsi="Arial" w:cs="Arial"/>
-          <w:b/>
-        </w:rPr>
-        <w:t>13</w:t>
-      </w:r>
-      <w:r>
-        <w:rPr>
-          <w:rFonts w:ascii="Arial" w:hAnsi="Arial" w:cs="Arial"/>
-          <w:b/>
-        </w:rPr>
-        <w:t>.</w:t>
-      </w:r>
-      <w:r>
-        <w:rPr>
-          <w:rFonts w:ascii="Arial" w:hAnsi="Arial" w:cs="Arial"/>
-          <w:b/>
-        </w:rPr>
-        <w:t>0</w:t>
-      </w:r>
-      <w:r>
-        <w:rPr>
-          <w:rFonts w:ascii="Arial" w:hAnsi="Arial" w:cs="Arial"/>
-          <w:b/>
-        </w:rPr>
-        <w:t>7</w:t>
-      </w:r>
-      <w:r>
-        <w:rPr>
-          <w:rFonts w:ascii="Arial" w:hAnsi="Arial" w:cs="Arial"/>
-          <w:b/>
-        </w:rPr>
-        <w:t>.202</w:t>
-      </w:r>
-      <w:r>
-        <w:rPr>
-          <w:rFonts w:ascii="Arial" w:hAnsi="Arial" w:cs="Arial"/>
-          <w:b/>
-        </w:rPr>
-        <w:t>3</w:t>
-      </w:r>
-      <w:r>
-        <w:rPr>
-          <w:rFonts w:ascii="Arial" w:hAnsi="Arial" w:cs="Arial"/>
-          <w:b/>
-        </w:rPr>
-        <w:t>г</w:t>
-      </w:r>
-      <w:bookmarkEnd w:id="19"/>
-      <w:r>
-        <w:rPr>
-          <w:rFonts w:ascii="Arial" w:hAnsi="Arial" w:cs="Arial"/>
-          <w:b/>
-        </w:rPr>
-        <w:t xml:space="preserve"> </w:t>
-      </w:r>
-      <w:r>
-        <w:rPr>
-          <w:rFonts w:ascii="Arial" w:hAnsi="Arial" w:cs="Arial"/>
-          <w:b/>
-          <w:lang w:val="uz-Cyrl-UZ"/>
-        </w:rPr>
-        <w:t xml:space="preserve"> </w:t>
-      </w:r>
-      <w:r>
-        <w:rPr>
-          <w:rFonts w:ascii="Arial" w:hAnsi="Arial" w:cs="Arial"/>
-          <w:b/>
-        </w:rPr>
-        <w:t xml:space="preserve"> </w:t>
-      </w:r>
-      <w:r>
-        <w:rPr>
-          <w:rFonts w:ascii="Arial" w:hAnsi="Arial" w:cs="Arial"/>
-          <w:b/>
-          <w:lang w:val="uz-Cyrl-UZ"/>
-        </w:rPr>
-        <w:t xml:space="preserve">года </w:t>
-      </w:r>
-      <w:r>
-        <w:rPr>
-          <w:rFonts w:ascii="Arial" w:hAnsi="Arial" w:cs="Arial"/>
-          <w:b/>
-        </w:rPr>
-        <w:t xml:space="preserve"> Республика   Узбекистан   Ферганский  область   РОВД </w:t>
-      </w:r>
-      <w:r>
-        <w:rPr>
-          <w:rFonts w:ascii="Arial" w:hAnsi="Arial" w:cs="Arial"/>
-          <w:b/>
-          <w:lang w:val="uz-Cyrl-UZ"/>
-        </w:rPr>
-        <w:t xml:space="preserve">,    живущий      пo   адресу:   </w:t>
-      </w:r>
-      <w:r>
-        <w:rPr>
-          <w:rFonts w:ascii="Arial" w:hAnsi="Arial" w:cs="Arial"/>
-          <w:b/>
-        </w:rPr>
-        <w:t>Республика     Узбекистан  Ферганский  область.</w:t>
-      </w:r>
-    </w:p>
-    <w:p>
-      <w:pPr>
-        <w:jc w:val="both"/>
-        <w:rPr>
-          <w:rFonts w:ascii="Arial" w:hAnsi="Arial" w:cs="Arial"/>
-          <w:b/>
-        </w:rPr>
-      </w:pPr>
-      <w:r>
-        <w:rPr>
-          <w:rFonts w:ascii="Arial" w:hAnsi="Arial" w:cs="Arial"/>
-          <w:b/>
-          <w:lang w:val="uz-Cyrl-UZ"/>
-        </w:rPr>
-        <w:t>Является представителем   Ассоциации  Международн</w:t>
-      </w:r>
-      <w:r>
-        <w:rPr>
-          <w:rFonts w:ascii="Arial" w:hAnsi="Arial" w:cs="Arial"/>
-          <w:b/>
-        </w:rPr>
-        <w:t>ы</w:t>
-      </w:r>
-      <w:r>
-        <w:rPr>
-          <w:rFonts w:ascii="Arial" w:hAnsi="Arial" w:cs="Arial"/>
-          <w:b/>
-          <w:lang w:val="uz-Cyrl-UZ"/>
-        </w:rPr>
-        <w:t>х  Автомобильных  перевозчиков Узбекистана  ООО “MUSFIRA  SAVDO TRANS”  и осуществляет  перевозки,  а так же  ООО “ MUSFIRA  SAVDO TRANS “ удостоверяет,  водитель имеет право  представлять интересы фырми  и  иных  организаций  подписывать договор  возмездных  услуг  поручительства договор  строхавания  иные  сопутствуюшие  документы  необходимые  для оформиления  ВТТ  МТТ,  и имеет право  подписи  при  составлении протокола  и расмотрении  дела  об  административных   нарушениях  и осуществлять  все необходимые  действия  связанные  с  выполнением  данного  поручения</w:t>
-      </w:r>
-      <w:r>
-        <w:rPr>
-          <w:rFonts w:ascii="Arial" w:hAnsi="Arial" w:cs="Arial"/>
-          <w:b/>
-        </w:rPr>
-        <w:t>,</w:t>
-      </w:r>
-      <w:r>
-        <w:rPr>
-          <w:rFonts w:ascii="Arial" w:hAnsi="Arial" w:cs="Arial"/>
-          <w:b/>
-          <w:lang w:val="uz-Cyrl-UZ"/>
-        </w:rPr>
-        <w:t xml:space="preserve"> при  нсобходимости ведение административ</w:t>
-      </w:r>
-      <w:r>
-        <w:rPr>
-          <w:rFonts w:ascii="Arial" w:hAnsi="Arial" w:cs="Arial"/>
-          <w:b/>
-        </w:rPr>
-        <w:t>них правонарушении, а также оплаты административных штрафов.</w:t>
-      </w:r>
-    </w:p>
-    <w:p>
-      <w:pPr>
-        <w:jc w:val="center"/>
-        <w:rPr>
-          <w:b/>
-          <w:sz w:val="24"/>
-          <w:szCs w:val="24"/>
-        </w:rPr>
-      </w:pPr>
-    </w:p>
-    <w:p>
-      <w:pPr>
-        <w:jc w:val="center"/>
-        <w:rPr>
-          <w:b/>
-          <w:sz w:val="24"/>
-          <w:szCs w:val="24"/>
-          <w:lang w:val="en-US"/>
-        </w:rPr>
-      </w:pPr>
-      <w:r>
-        <w:rPr>
-          <w:b/>
-          <w:sz w:val="24"/>
-          <w:szCs w:val="24"/>
-          <w:lang w:val="en-US"/>
-        </w:rPr>
-        <w:t xml:space="preserve">A/M № </w:t>
-      </w:r>
-      <w:proofErr w:type="gramStart"/>
-      <w:r>
-        <w:rPr>
-          <w:b/>
-          <w:sz w:val="24"/>
-          <w:szCs w:val="24"/>
-        </w:rPr>
-        <w:t>Марка</w:t>
-      </w:r>
-      <w:r>
-        <w:rPr>
-          <w:b/>
-          <w:sz w:val="24"/>
-          <w:szCs w:val="24"/>
-          <w:lang w:val="en-US"/>
-        </w:rPr>
-        <w:t xml:space="preserve"> :</w:t>
-      </w:r>
-      <w:proofErr w:type="gramEnd"/>
-      <w:r>
-        <w:rPr>
-          <w:b/>
-          <w:sz w:val="24"/>
-          <w:szCs w:val="24"/>
-          <w:lang w:val="en-US"/>
-        </w:rPr>
-        <w:t xml:space="preserve"> </w:t>
-      </w:r>
-      <w:r>
-        <w:rPr>
-          <w:b/>
-          <w:sz w:val="24"/>
-          <w:szCs w:val="24"/>
-          <w:lang w:val="en-US"/>
-        </w:rPr>
-        <w:t xml:space="preserve"> </w:t>
-      </w:r>
-      <w:r>
-        <w:rPr>
-          <w:b/>
-          <w:sz w:val="24"/>
-          <w:szCs w:val="24"/>
-          <w:lang w:val="en-US"/>
-        </w:rPr>
-        <w:t>DAF</w:t>
-      </w:r>
-      <w:r>
-        <w:rPr>
-          <w:b/>
-          <w:sz w:val="24"/>
-          <w:szCs w:val="24"/>
-          <w:lang w:val="en-US"/>
-        </w:rPr>
-        <w:t xml:space="preserve"> FT</w:t>
-      </w:r>
-      <w:r>
-        <w:rPr>
-          <w:b/>
-          <w:sz w:val="24"/>
-          <w:szCs w:val="24"/>
-          <w:lang w:val="en-US"/>
-        </w:rPr>
-        <w:t xml:space="preserve"> XF </w:t>
-      </w:r>
-      <w:r>
-        <w:rPr>
-          <w:b/>
-          <w:sz w:val="24"/>
-          <w:szCs w:val="24"/>
-          <w:lang w:val="en-US"/>
-        </w:rPr>
-        <w:t>40R650QB</w:t>
-      </w:r>
-    </w:p>
-    <w:p>
-      <w:pPr>
-        <w:jc w:val="center"/>
-        <w:rPr>
-          <w:b/>
-          <w:sz w:val="24"/>
-          <w:szCs w:val="24"/>
-          <w:lang w:val="en-US"/>
-        </w:rPr>
-      </w:pPr>
-      <w:r>
-        <w:rPr>
-          <w:b/>
-          <w:sz w:val="24"/>
-          <w:szCs w:val="24"/>
-        </w:rPr>
-        <w:t>П</w:t>
-      </w:r>
-      <w:r>
-        <w:rPr>
-          <w:b/>
-          <w:sz w:val="24"/>
-          <w:szCs w:val="24"/>
-          <w:lang w:val="en-US"/>
-        </w:rPr>
-        <w:t>/</w:t>
-      </w:r>
-      <w:r>
-        <w:rPr>
-          <w:b/>
-          <w:sz w:val="24"/>
-          <w:szCs w:val="24"/>
-        </w:rPr>
-        <w:t>П</w:t>
-      </w:r>
-      <w:r>
-        <w:rPr>
-          <w:b/>
-          <w:sz w:val="24"/>
-          <w:szCs w:val="24"/>
-          <w:lang w:val="en-US"/>
-        </w:rPr>
-        <w:t xml:space="preserve"> № </w:t>
-      </w:r>
-      <w:proofErr w:type="gramStart"/>
-      <w:r>
-        <w:rPr>
-          <w:b/>
-          <w:sz w:val="24"/>
-          <w:szCs w:val="24"/>
-        </w:rPr>
-        <w:t>Марка</w:t>
-      </w:r>
-      <w:r>
-        <w:rPr>
-          <w:b/>
-          <w:sz w:val="24"/>
-          <w:szCs w:val="24"/>
-          <w:lang w:val="en-US"/>
-        </w:rPr>
-        <w:t xml:space="preserve">:  </w:t>
-      </w:r>
-      <w:r>
-        <w:rPr>
-          <w:b/>
-          <w:sz w:val="24"/>
-          <w:szCs w:val="24"/>
-          <w:lang w:val="en-US"/>
-        </w:rPr>
-        <w:t>KAESSBOHRER</w:t>
-      </w:r>
-      <w:proofErr w:type="gramEnd"/>
-      <w:r>
-        <w:rPr>
-          <w:b/>
-          <w:sz w:val="24"/>
-          <w:szCs w:val="24"/>
-          <w:lang w:val="en-US"/>
-        </w:rPr>
-        <w:t xml:space="preserve"> MAXIMA 400724CA.</w:t>
-      </w:r>
-    </w:p>
-    <w:p>
-      <w:pPr>
-        <w:jc w:val="center"/>
-        <w:rPr>
-          <w:rFonts w:ascii="Times New Roman" w:hAnsi="Times New Roman"/>
-          <w:b/>
-          <w:sz w:val="24"/>
-          <w:szCs w:val="24"/>
-          <w:lang w:val="en-US"/>
-        </w:rPr>
-      </w:pPr>
-    </w:p>
-    <w:p>
-      <w:pPr>
-        <w:jc w:val="center"/>
-        <w:rPr>
-          <w:rFonts w:ascii="Times New Roman" w:hAnsi="Times New Roman"/>
-          <w:b/>
-          <w:sz w:val="24"/>
-          <w:szCs w:val="24"/>
-        </w:rPr>
-      </w:pPr>
-      <w:r>
-        <w:rPr>
-          <w:rFonts w:ascii="Times New Roman" w:hAnsi="Times New Roman"/>
-          <w:b/>
-          <w:sz w:val="24"/>
-          <w:szCs w:val="24"/>
-        </w:rPr>
-        <w:t xml:space="preserve">Настоящий </w:t>
-      </w:r>
-      <w:proofErr w:type="gramStart"/>
-      <w:r>
-        <w:rPr>
-          <w:rFonts w:ascii="Times New Roman" w:hAnsi="Times New Roman"/>
-          <w:b/>
-          <w:sz w:val="24"/>
-          <w:szCs w:val="24"/>
-        </w:rPr>
-        <w:t>доверенность  вступает</w:t>
-      </w:r>
-      <w:proofErr w:type="gramEnd"/>
-      <w:r>
-        <w:rPr>
-          <w:rFonts w:ascii="Times New Roman" w:hAnsi="Times New Roman"/>
-          <w:b/>
-          <w:sz w:val="24"/>
-          <w:szCs w:val="24"/>
-        </w:rPr>
-        <w:t xml:space="preserve"> в силу с момента подписания и действует  с</w:t>
-      </w:r>
-      <w:r>
-        <w:rPr>
-          <w:rFonts w:ascii="Times New Roman" w:hAnsi="Times New Roman"/>
-          <w:b/>
-          <w:sz w:val="24"/>
-          <w:szCs w:val="24"/>
-        </w:rPr>
-        <w:t xml:space="preserve">  </w:t>
-      </w:r>
-      <w:r>
-        <w:rPr>
-          <w:rFonts w:ascii="Times New Roman" w:hAnsi="Times New Roman"/>
-          <w:b/>
-          <w:sz w:val="24"/>
-          <w:szCs w:val="24"/>
-        </w:rPr>
-        <w:t xml:space="preserve">   «</w:t>
-      </w:r>
-      <w:r>
-        <w:rPr>
-          <w:rFonts w:ascii="Times New Roman" w:hAnsi="Times New Roman"/>
-          <w:b/>
-          <w:sz w:val="24"/>
-          <w:szCs w:val="24"/>
-        </w:rPr>
-        <w:t>14</w:t>
-      </w:r>
-      <w:r>
-        <w:rPr>
-          <w:rFonts w:ascii="Times New Roman" w:hAnsi="Times New Roman"/>
-          <w:b/>
-          <w:sz w:val="24"/>
-          <w:szCs w:val="24"/>
-        </w:rPr>
-        <w:t>»</w:t>
-      </w:r>
-      <w:r>
-        <w:rPr>
-          <w:rFonts w:ascii="Times New Roman" w:hAnsi="Times New Roman"/>
-          <w:b/>
-          <w:sz w:val="24"/>
-          <w:szCs w:val="24"/>
-        </w:rPr>
-        <w:t xml:space="preserve"> 0</w:t>
-      </w:r>
-      <w:r>
-        <w:rPr>
-          <w:rFonts w:ascii="Times New Roman" w:hAnsi="Times New Roman"/>
-          <w:b/>
-          <w:sz w:val="24"/>
-          <w:szCs w:val="24"/>
-        </w:rPr>
-        <w:t>8</w:t>
-      </w:r>
-      <w:r>
-        <w:rPr>
-          <w:rFonts w:ascii="Times New Roman" w:hAnsi="Times New Roman"/>
-          <w:b/>
-          <w:sz w:val="24"/>
-          <w:szCs w:val="24"/>
-        </w:rPr>
-        <w:t>. 202</w:t>
-      </w:r>
-      <w:r>
-        <w:rPr>
-          <w:rFonts w:ascii="Times New Roman" w:hAnsi="Times New Roman"/>
-          <w:b/>
-          <w:sz w:val="24"/>
-          <w:szCs w:val="24"/>
-        </w:rPr>
-        <w:t>6</w:t>
-      </w:r>
-      <w:r>
-        <w:rPr>
-          <w:rFonts w:ascii="Times New Roman" w:hAnsi="Times New Roman"/>
-          <w:b/>
-          <w:sz w:val="24"/>
-          <w:szCs w:val="24"/>
-        </w:rPr>
-        <w:t>г</w:t>
-      </w:r>
-      <w:r>
-        <w:rPr>
-          <w:rFonts w:ascii="Times New Roman" w:hAnsi="Times New Roman"/>
-          <w:b/>
-          <w:sz w:val="24"/>
-          <w:szCs w:val="24"/>
-        </w:rPr>
-        <w:t xml:space="preserve">  по  «</w:t>
-      </w:r>
-      <w:r>
-        <w:rPr>
-          <w:rFonts w:ascii="Times New Roman" w:hAnsi="Times New Roman"/>
-          <w:b/>
-          <w:sz w:val="24"/>
-          <w:szCs w:val="24"/>
-        </w:rPr>
-        <w:t>13</w:t>
-      </w:r>
-      <w:r>
-        <w:rPr>
-          <w:rFonts w:ascii="Times New Roman" w:hAnsi="Times New Roman"/>
-          <w:b/>
-          <w:sz w:val="24"/>
-          <w:szCs w:val="24"/>
-        </w:rPr>
-        <w:t>»</w:t>
-      </w:r>
-      <w:r>
-        <w:rPr>
-          <w:rFonts w:ascii="Times New Roman" w:hAnsi="Times New Roman"/>
-          <w:b/>
-          <w:sz w:val="24"/>
-          <w:szCs w:val="24"/>
-        </w:rPr>
-        <w:t>08</w:t>
-      </w:r>
-      <w:r>
-        <w:rPr>
-          <w:rFonts w:ascii="Times New Roman" w:hAnsi="Times New Roman"/>
-          <w:b/>
-          <w:sz w:val="24"/>
-          <w:szCs w:val="24"/>
-        </w:rPr>
-        <w:t>. 202</w:t>
-      </w:r>
-      <w:r>
-        <w:rPr>
-          <w:rFonts w:ascii="Times New Roman" w:hAnsi="Times New Roman"/>
-          <w:b/>
-          <w:sz w:val="24"/>
-          <w:szCs w:val="24"/>
-        </w:rPr>
-        <w:t>8</w:t>
-      </w:r>
-      <w:r>
-        <w:rPr>
-          <w:rFonts w:ascii="Times New Roman" w:hAnsi="Times New Roman"/>
-          <w:b/>
-          <w:sz w:val="24"/>
-          <w:szCs w:val="24"/>
-        </w:rPr>
-        <w:t xml:space="preserve">  г</w:t>
-      </w:r>
-    </w:p>
-    <w:p>
-      <w:pPr>
-        <w:jc w:val="center"/>
-        <w:rPr>
-          <w:b/>
-          <w:sz w:val="24"/>
-          <w:szCs w:val="24"/>
-        </w:rPr>
-      </w:pPr>
-    </w:p>
-    <w:p>
-      <w:pPr>
-        <w:tabs>
-          <w:tab w:val="left" w:pos="367"/>
-        </w:tabs>
-        <w:rPr>
-          <w:b/>
-          <w:sz w:val="28"/>
-          <w:szCs w:val="28"/>
-          <w:lang w:val="uz-Cyrl-UZ"/>
-        </w:rPr>
-      </w:pPr>
-    </w:p>
-    <w:p>
-      <w:pPr>
-        <w:tabs>
-          <w:tab w:val="left" w:pos="367"/>
-        </w:tabs>
-        <w:rPr>
-          <w:sz w:val="28"/>
-          <w:szCs w:val="28"/>
-          <w:lang w:val="uz-Cyrl-UZ"/>
-        </w:rPr>
-      </w:pPr>
-      <w:r>
-        <w:rPr>
-          <w:b/>
-          <w:sz w:val="28"/>
-          <w:szCs w:val="28"/>
-          <w:lang w:val="uz-Cyrl-UZ"/>
-        </w:rPr>
-        <w:t>ООО “MUSFIRA  SAVDO TRANS</w:t>
-      </w:r>
-      <w:r>
-        <w:rPr>
-          <w:b/>
-          <w:sz w:val="28"/>
-          <w:szCs w:val="28"/>
-          <w:lang w:val="uz-Cyrl-UZ"/>
-        </w:rPr>
-        <w:t xml:space="preserve">” </w:t>
-      </w:r>
-      <w:r>
-        <w:rPr>
-          <w:b/>
-          <w:sz w:val="28"/>
-          <w:szCs w:val="28"/>
-          <w:lang w:val="uz-Cyrl-UZ"/>
-        </w:rPr>
-        <w:t>дире</w:t>
-      </w:r>
-      <w:r>
-        <w:rPr>
-          <w:b/>
-          <w:sz w:val="28"/>
-          <w:szCs w:val="28"/>
-          <w:lang w:val="uz-Cyrl-UZ"/>
-        </w:rPr>
-        <w:t>к</w:t>
-      </w:r>
-      <w:r>
-        <w:rPr>
-          <w:b/>
-          <w:sz w:val="28"/>
-          <w:szCs w:val="28"/>
-          <w:lang w:val="uz-Cyrl-UZ"/>
-        </w:rPr>
-        <w:t xml:space="preserve">тор </w:t>
-      </w:r>
-      <w:r>
-        <w:rPr>
-          <w:b/>
-          <w:sz w:val="28"/>
-          <w:szCs w:val="28"/>
-          <w:lang w:val="uz-Cyrl-UZ"/>
-        </w:rPr>
-        <w:t>:</w:t>
-      </w:r>
-      <w:r>
-        <w:rPr>
-          <w:b/>
-          <w:sz w:val="28"/>
-          <w:szCs w:val="28"/>
-          <w:lang w:val="uz-Cyrl-UZ"/>
-        </w:rPr>
-        <w:t xml:space="preserve">            </w:t>
-      </w:r>
-      <w:r>
-        <w:rPr>
-          <w:b/>
-          <w:sz w:val="28"/>
-          <w:szCs w:val="28"/>
-          <w:lang w:val="uz-Cyrl-UZ"/>
-        </w:rPr>
-        <w:t xml:space="preserve">     </w:t>
-      </w:r>
-      <w:r>
-        <w:rPr>
-          <w:b/>
-          <w:sz w:val="28"/>
-          <w:szCs w:val="28"/>
-          <w:lang w:val="uz-Cyrl-UZ"/>
-        </w:rPr>
-        <w:t xml:space="preserve">  Б.</w:t>
-      </w:r>
-      <w:r>
-        <w:rPr>
-          <w:b/>
-          <w:sz w:val="28"/>
-          <w:szCs w:val="28"/>
-          <w:lang w:val="uz-Cyrl-UZ"/>
-        </w:rPr>
-        <w:t>П.</w:t>
-      </w:r>
-      <w:r>
-        <w:rPr>
-          <w:b/>
-          <w:sz w:val="28"/>
-          <w:szCs w:val="28"/>
-          <w:lang w:val="uz-Cyrl-UZ"/>
-        </w:rPr>
-        <w:t xml:space="preserve"> МАМАЖОНОВ</w:t>
       </w:r>
     </w:p>
     <w:sectPr>

</xml_diff>